<commit_message>
docs(standards): the BLUF reproduced two sections instead of pointing at them
The document's headline rule is to state a load-bearing fact once and link to it, and
"In short" broke it twice. "What it costs" carried compressed copies of all three
bullets of "What this costs you", intact 75 lines below; "What it demands" opened with
a reworded copy of the sentence that opened "The shape".

The cost paragraph becomes a pointer: three nouns and a link, no reproduction. The
demand sentence is moved rather than copied -- it reads as the bottom line, so it now
lives in the BLUF and links back to the section that says what is in each layer. "The
shape" opens on the layers themselves, which its own heading already announces.

74/74 tests pass and the Word copy is regenerated with the pandoc command in
tests/test_word_copies_track_the_markdown.py.

Co-Authored-By: Claude Opus 5 <noreply@anthropic.com>
</commit_message>
<xml_diff>
--- a/docs/standards/word/SECURE-DEVELOPMENT.docx
+++ b/docs/standards/word/SECURE-DEVELOPMENT.docx
@@ -185,13 +185,36 @@
         <w:t xml:space="preserve"> </w:t>
       </w:r>
       <w:r>
-        <w:t xml:space="preserve">Judge a build as a composite of two layers, and never on one row of either. A</w:t>
-      </w:r>
-      <w:r>
-        <w:t xml:space="preserve"> </w:t>
-      </w:r>
-      <w:r>
-        <w:t xml:space="preserve">named set of checks blocks every change and cannot be waived by an author. Every trust</w:t>
+        <w:t xml:space="preserve">Judge a build's security as a composite of two layers. Never on one row of</w:t>
+      </w:r>
+      <w:r>
+        <w:t xml:space="preserve"> </w:t>
+      </w:r>
+      <w:r>
+        <w:t xml:space="preserve">either --</w:t>
+      </w:r>
+      <w:r>
+        <w:t xml:space="preserve"> </w:t>
+      </w:r>
+      <w:hyperlink w:anchor="X72e8a7b0eb017be1b6be4ce9a7aa4c29f34647f">
+        <w:r>
+          <w:rPr>
+            <w:rStyle w:val="Hyperlink"/>
+          </w:rPr>
+          <w:t xml:space="preserve">the shape</w:t>
+        </w:r>
+      </w:hyperlink>
+      <w:r>
+        <w:t xml:space="preserve"> </w:t>
+      </w:r>
+      <w:r>
+        <w:t xml:space="preserve">says what is in</w:t>
+      </w:r>
+      <w:r>
+        <w:t xml:space="preserve"> </w:t>
+      </w:r>
+      <w:r>
+        <w:t xml:space="preserve">each. A named set of checks blocks every change and cannot be waived by an author. Every trust</w:t>
       </w:r>
       <w:r>
         <w:t xml:space="preserve"> </w:t>
@@ -227,25 +250,30 @@
         <w:t xml:space="preserve"> </w:t>
       </w:r>
       <w:r>
-        <w:t xml:space="preserve">Calendar time in the two places that resist automation: threat modeling before</w:t>
-      </w:r>
-      <w:r>
-        <w:t xml:space="preserve"> </w:t>
-      </w:r>
-      <w:r>
-        <w:t xml:space="preserve">the build, and vulnerability response rehearsed end to end. Controls you do not own and must not</w:t>
-      </w:r>
-      <w:r>
-        <w:t xml:space="preserve"> </w:t>
-      </w:r>
-      <w:r>
-        <w:t xml:space="preserve">claim, because they belong to whoever runs the software. And a gap you cannot close by working</w:t>
-      </w:r>
-      <w:r>
-        <w:t xml:space="preserve"> </w:t>
-      </w:r>
-      <w:r>
-        <w:t xml:space="preserve">harder, held under a signed acceptance rather than argued away.</w:t>
+        <w:t xml:space="preserve">Calendar time where automation does not reach, controls you must not claim</w:t>
+      </w:r>
+      <w:r>
+        <w:t xml:space="preserve"> </w:t>
+      </w:r>
+      <w:r>
+        <w:t xml:space="preserve">because you do not own them, and a gap you cannot close by working harder.</w:t>
+      </w:r>
+      <w:r>
+        <w:t xml:space="preserve"> </w:t>
+      </w:r>
+      <w:hyperlink w:anchor="what-this-costs-you">
+        <w:r>
+          <w:rPr>
+            <w:rStyle w:val="Hyperlink"/>
+          </w:rPr>
+          <w:t xml:space="preserve">What this costs you</w:t>
+        </w:r>
+      </w:hyperlink>
+      <w:r>
+        <w:t xml:space="preserve"> </w:t>
+      </w:r>
+      <w:r>
+        <w:t xml:space="preserve">is the list, and it is short.</w:t>
       </w:r>
     </w:p>
     <w:p>
@@ -1688,14 +1716,6 @@
     <w:p>
       <w:pPr>
         <w:pStyle w:val="FirstParagraph"/>
-      </w:pPr>
-      <w:r>
-        <w:t xml:space="preserve">Judge a build's security as a composite of two layers. Never on one row of either.</w:t>
-      </w:r>
-    </w:p>
-    <w:p>
-      <w:pPr>
-        <w:pStyle w:val="BodyText"/>
       </w:pPr>
       <w:r>
         <w:t xml:space="preserve">The machine-enforced layer is blocking analysis and secret-scan gates, secure coding practice,</w:t>

</xml_diff>

<commit_message>
docs(standards): gloss the first citation mark, which sits far ahead of its definition
The restructure's one relocation moved "Where the rules come from" to the back matter, which
put the first bracketed mark about 1300 lines ahead of the taxonomy that defines it. The BLUF
carries a pointer, but a pointer read at line 46 is weaker than adjacency at the moment a
reader actually meets an unexplained "[prompted by: ...]" in the body.

Glossed at the first occurrence only, parenthesised so it reads as an aside rather than as
rule text the mark could be taken to attach to. The other 21 mark sites are untouched, and the
relocation stands -- reversing it would reopen settled, verified work for a problem that has a
cheaper fix.

All 26 citation marks still byte-identical, 157 in-page anchors all resolving, Word copy
regenerated with pandoc 3.10.

Co-Authored-By: Claude Opus 5 <noreply@anthropic.com>
</commit_message>
<xml_diff>
--- a/docs/standards/word/SECURE-DEVELOPMENT.docx
+++ b/docs/standards/word/SECURE-DEVELOPMENT.docx
@@ -2638,7 +2638,36 @@
         <w:t xml:space="preserve"> </w:t>
       </w:r>
       <w:r>
-        <w:t xml:space="preserve">The two columns above have no room</w:t>
+        <w:t xml:space="preserve">(The first of the bracketed marks:</w:t>
+      </w:r>
+      <w:r>
+        <w:t xml:space="preserve"> </w:t>
+      </w:r>
+      <w:r>
+        <w:t xml:space="preserve">the source raised the topic, and the rule as written is ours.</w:t>
+      </w:r>
+      <w:r>
+        <w:t xml:space="preserve"> </w:t>
+      </w:r>
+      <w:hyperlink w:anchor="where-the-rules-come-from">
+        <w:r>
+          <w:rPr>
+            <w:rStyle w:val="Hyperlink"/>
+          </w:rPr>
+          <w:t xml:space="preserve">Where the rules come from</w:t>
+        </w:r>
+      </w:hyperlink>
+      <w:r>
+        <w:t xml:space="preserve"> </w:t>
+      </w:r>
+      <w:r>
+        <w:t xml:space="preserve">defines this one and the other two.) The two</w:t>
+      </w:r>
+      <w:r>
+        <w:t xml:space="preserve"> </w:t>
+      </w:r>
+      <w:r>
+        <w:t xml:space="preserve">columns above have no room</w:t>
       </w:r>
       <w:r>
         <w:t xml:space="preserve"> </w:t>

</xml_diff>